<commit_message>
test: align expanded suite with latest main
</commit_message>
<xml_diff>
--- a/06_defense/杨任宇班-13组-摸鱼-中期审查清单-测试补强版.docx
+++ b/06_defense/杨任宇班-13组-摸鱼-中期审查清单-测试补强版.docx
@@ -2755,7 +2755,7 @@
                 <w:position w:val="3"/>
                 <w:lang w:eastAsia="zh-CN"/>
               </w:rPr>
-              <w:t>自动化测试共 187 条：前端 82 条（Vitest 78、E2E 4），后端单体 93 条（单元/安全/控制器 61、API 32），微服务/网关 12 条。前端覆盖率为语句 94.38%、分支 82.77%、函数 94.33%、行 94.38%，四项均超过 80% 门禁。npm run verify 本机验证后端 61 条、前端 78 条及生产构建全部通过。</w:t>
+              <w:t>自动化测试共 212 条：前端 94 条（Vitest 90、E2E 4），后端单体 93 条（单元/安全/控制器 61、API 32），微服务/网关 25 条。前端覆盖率为语句 94.30%、分支 83.63%、函数 94.33%、行 94.30%，四项均超过 80% 门禁。npm run verify 本机验证后端 61 条、前端 90 条及生产构建全部通过。</w:t>
             </w:r>
             <w:r>
               <w:rPr>
@@ -7777,7 +7777,7 @@
           <w:szCs w:val="18"/>
           <w:lang w:eastAsia="zh-CN"/>
         </w:rPr>
-        <w:t>1. 06_defense/小学期交付总览.md：中期七项对照。 2. 02_docs/微服务接口与数据归属.md：服务划分、接口、表归属、失败处理。 3. 02_docs/图表绘制与插入位置清单.md：31 张必需图和导出检查。 4. 04_tests/README.md、04_tests/reports/tests/测试报告-小学期.md：187 条自动化测试、覆盖率与验证命令。 5. 03_devops/2026-08-27-微服务Kubernetes验证记录.md、03_devops/2026-08-30-D6-01三业务微服务验收记录.md：部署、数据库隔离、流水线和健康检查。</w:t>
+        <w:t>1. 06_defense/小学期交付总览.md：中期七项对照。 2. 02_docs/微服务接口与数据归属.md：服务划分、接口、表归属、失败处理。 3. 02_docs/图表绘制与插入位置清单.md：31 张必需图和导出检查。 4. 04_tests/README.md、04_tests/reports/tests/测试报告-小学期.md：212 条自动化测试、覆盖率与验证命令。 5. 03_devops/2026-08-27-微服务Kubernetes验证记录.md、03_devops/2026-08-30-D6-01三业务微服务验收记录.md：部署、数据库隔离、流水线和健康检查。</w:t>
       </w:r>
       <w:r>
         <w:rPr>

</xml_diff>